<commit_message>
Update attribution, license and manuals
Correct attribution and wording across project documentation: adjust copyright holder name in LICENSE; normalize contributor names/order and clarify EU funding disclaimer in NOTICE.md and README.md; apply minor formatting tweaks. Also replace updated binary operator and user manual .docx files in docs/.
</commit_message>
<xml_diff>
--- a/docs/BRIDGE_Operator_Manual_AutoSTEM.docx
+++ b/docs/BRIDGE_Operator_Manual_AutoSTEM.docx
@@ -385,31 +385,7 @@
     </w:p>
     <w:p>
       <w:r>
-        <w:t xml:space="preserve">In this context, the application is </w:t>
-      </w:r>
-      <w:proofErr w:type="spellStart"/>
-      <w:r>
-        <w:t>centered</w:t>
-      </w:r>
-      <w:proofErr w:type="spellEnd"/>
-      <w:r>
-        <w:t xml:space="preserve"> on the </w:t>
-      </w:r>
-      <w:proofErr w:type="spellStart"/>
-      <w:r>
-        <w:t>BalaC</w:t>
-      </w:r>
-      <w:proofErr w:type="spellEnd"/>
-      <w:r>
-        <w:t xml:space="preserve"> robot and its PID control playground, where users are tasked with creating programs of increasing complexity by tuning control parameters and observing system </w:t>
-      </w:r>
-      <w:proofErr w:type="spellStart"/>
-      <w:r>
-        <w:t>behavior</w:t>
-      </w:r>
-      <w:proofErr w:type="spellEnd"/>
-      <w:r>
-        <w:t xml:space="preserve"> in real time.</w:t>
+        <w:t>In this context, the application is centered on the BalaC robot and its PID control playground, where users are tasked with creating programs of increasing complexity by tuning control parameters and observing system behavior in real time.</w:t>
       </w:r>
     </w:p>
     <w:p>
@@ -489,15 +465,7 @@
     </w:p>
     <w:p>
       <w:r>
-        <w:t xml:space="preserve">The </w:t>
-      </w:r>
-      <w:proofErr w:type="spellStart"/>
-      <w:r>
-        <w:t>BalaC</w:t>
-      </w:r>
-      <w:proofErr w:type="spellEnd"/>
-      <w:r>
-        <w:t xml:space="preserve"> PID playground is particularly suited for secondary school and early university level education, where users can experiment with control logic in a safe simulated environment.</w:t>
+        <w:t>The BalaC PID playground is particularly suited for secondary school and early university level education, where users can experiment with control logic in a safe simulated environment.</w:t>
       </w:r>
     </w:p>
     <w:p>
@@ -510,15 +478,7 @@
     </w:p>
     <w:p>
       <w:r>
-        <w:t>B.R.I.D.G.E. was developed using the Unity 6 game engine, with the HDRP (</w:t>
-      </w:r>
-      <w:proofErr w:type="gramStart"/>
-      <w:r>
-        <w:t>High Definition</w:t>
-      </w:r>
-      <w:proofErr w:type="gramEnd"/>
-      <w:r>
-        <w:t xml:space="preserve"> Render Pipeline) graphics pipeline. Unity employs the C# programming language, and Visual Studio Code was used as the development environment.</w:t>
+        <w:t>B.R.I.D.G.E. was developed using the Unity 6 game engine, with the HDRP (High Definition Render Pipeline) graphics pipeline. Unity employs the C# programming language, and Visual Studio Code was used as the development environment.</w:t>
       </w:r>
     </w:p>
     <w:p>
@@ -528,41 +488,12 @@
     </w:p>
     <w:p>
       <w:r>
-        <w:t xml:space="preserve">The </w:t>
-      </w:r>
-      <w:proofErr w:type="spellStart"/>
-      <w:r>
-        <w:t>BalaC</w:t>
-      </w:r>
-      <w:proofErr w:type="spellEnd"/>
-      <w:r>
-        <w:t xml:space="preserve"> robot model, used in the PID playground, was developed using CAD tools (e.g., Solid Edge), while environmental assets and additional graphical elements were created using tools such as Blender and integrated within Unity.</w:t>
-      </w:r>
-    </w:p>
-    <w:p>
-      <w:r>
-        <w:t>All graphical models were imported into Unity in standard formats such as .</w:t>
-      </w:r>
-      <w:proofErr w:type="spellStart"/>
-      <w:r>
-        <w:t>obj</w:t>
-      </w:r>
-      <w:proofErr w:type="spellEnd"/>
-      <w:r>
-        <w:t xml:space="preserve"> </w:t>
-      </w:r>
-      <w:proofErr w:type="gramStart"/>
-      <w:r>
-        <w:t>and .</w:t>
-      </w:r>
-      <w:proofErr w:type="spellStart"/>
-      <w:r>
-        <w:t>fbx</w:t>
-      </w:r>
-      <w:proofErr w:type="spellEnd"/>
-      <w:proofErr w:type="gramEnd"/>
-      <w:r>
-        <w:t>.</w:t>
+        <w:t>The BalaC robot model, used in the PID playground, was developed using CAD tools (e.g., Solid Edge), while environmental assets and additional graphical elements were created using tools such as Blender and integrated within Unity.</w:t>
+      </w:r>
+    </w:p>
+    <w:p>
+      <w:r>
+        <w:t>All graphical models were imported into Unity in standard formats such as .obj and .fbx.</w:t>
       </w:r>
     </w:p>
     <w:p>
@@ -823,15 +754,7 @@
           </w:tcPr>
           <w:p>
             <w:r>
-              <w:t xml:space="preserve">Modern quad-core processor (e.g., Intel Core i5 or AMD </w:t>
-            </w:r>
-            <w:proofErr w:type="spellStart"/>
-            <w:r>
-              <w:t>Ryzen</w:t>
-            </w:r>
-            <w:proofErr w:type="spellEnd"/>
-            <w:r>
-              <w:t xml:space="preserve"> equivalent).</w:t>
+              <w:t>Modern quad-core processor (e.g., Intel Core i5 or AMD Ryzen equivalent).</w:t>
             </w:r>
           </w:p>
         </w:tc>
@@ -989,25 +912,7 @@
           <w:rPr>
             <w:rStyle w:val="Hyperlink"/>
           </w:rPr>
-          <w:t>https://git</w:t>
-        </w:r>
-        <w:r>
-          <w:rPr>
-            <w:rStyle w:val="Hyperlink"/>
-          </w:rPr>
-          <w:t>h</w:t>
-        </w:r>
-        <w:r>
-          <w:rPr>
-            <w:rStyle w:val="Hyperlink"/>
-          </w:rPr>
-          <w:t>ub.com/ANcybernetics/AutoSTEM-VirtualToolkit/releases/tag/v1.0.</w:t>
-        </w:r>
-        <w:r>
-          <w:rPr>
-            <w:rStyle w:val="Hyperlink"/>
-          </w:rPr>
-          <w:t>0</w:t>
+          <w:t>https://github.com/ANcybernetics/AutoSTEM-VirtualToolkit/releases/tag/v1.0.0</w:t>
         </w:r>
       </w:hyperlink>
       <w:r>
@@ -1186,15 +1091,7 @@
     </w:p>
     <w:p>
       <w:r>
-        <w:t xml:space="preserve">Once executed, the game will start, presenting the main screen with access to the </w:t>
-      </w:r>
-      <w:proofErr w:type="spellStart"/>
-      <w:r>
-        <w:t>BalaC</w:t>
-      </w:r>
-      <w:proofErr w:type="spellEnd"/>
-      <w:r>
-        <w:t xml:space="preserve"> PID playground environment.</w:t>
+        <w:t>Once executed, the game will start, presenting the main screen with access to the BalaC PID playground environment.</w:t>
       </w:r>
     </w:p>
     <w:p>
@@ -1218,15 +1115,7 @@
     </w:p>
     <w:p>
       <w:r>
-        <w:t xml:space="preserve">In this configuration, the simulator focuses on the </w:t>
-      </w:r>
-      <w:proofErr w:type="spellStart"/>
-      <w:r>
-        <w:t>BalaC</w:t>
-      </w:r>
-      <w:proofErr w:type="spellEnd"/>
-      <w:r>
-        <w:t xml:space="preserve"> robot and its PID control playground.</w:t>
+        <w:t>In this configuration, the simulator focuses on the BalaC robot and its PID control playground.</w:t>
       </w:r>
     </w:p>
     <w:p>
@@ -1316,15 +1205,7 @@
     </w:p>
     <w:p>
       <w:r>
-        <w:t xml:space="preserve">This section describes the custom blocks available for controlling the </w:t>
-      </w:r>
-      <w:proofErr w:type="spellStart"/>
-      <w:r>
-        <w:t>BalaC</w:t>
-      </w:r>
-      <w:proofErr w:type="spellEnd"/>
-      <w:r>
-        <w:t xml:space="preserve"> robot within the PID playground environment.</w:t>
+        <w:t>This section describes the custom blocks available for controlling the BalaC robot within the PID playground environment.</w:t>
       </w:r>
     </w:p>
     <w:p>
@@ -1380,14 +1261,12 @@
         </w:rPr>
         <w:t xml:space="preserve">Figure 3.1: </w:t>
       </w:r>
-      <w:proofErr w:type="spellStart"/>
       <w:r>
         <w:rPr>
           <w:i/>
         </w:rPr>
         <w:t>BalaC</w:t>
       </w:r>
-      <w:proofErr w:type="spellEnd"/>
       <w:r>
         <w:t xml:space="preserve"> </w:t>
       </w:r>
@@ -1400,15 +1279,7 @@
     </w:p>
     <w:p>
       <w:r>
-        <w:t>Access to the control primitives of AutoSTEM occurs through the dedicated section in the programming interface. By selecting the "</w:t>
-      </w:r>
-      <w:proofErr w:type="spellStart"/>
-      <w:r>
-        <w:t>BalaC</w:t>
-      </w:r>
-      <w:proofErr w:type="spellEnd"/>
-      <w:r>
-        <w:t>" category, one accesses the panel containing the functional blocks for managing movement and sensors.</w:t>
+        <w:t>Access to the control primitives of AutoSTEM occurs through the dedicated section in the programming interface. By selecting the "BalaC" category, one accesses the panel containing the functional blocks for managing movement and sensors.</w:t>
       </w:r>
     </w:p>
     <w:p>
@@ -1417,74 +1288,56 @@
       </w:pPr>
       <w:r>
         <w:lastRenderedPageBreak/>
-        <w:t xml:space="preserve">3.1.1 </w:t>
-      </w:r>
-      <w:proofErr w:type="spellStart"/>
-      <w:r>
-        <w:t>BalaC</w:t>
-      </w:r>
-      <w:proofErr w:type="spellEnd"/>
-      <w:r>
-        <w:t xml:space="preserve"> Custom Blocks</w:t>
-      </w:r>
-    </w:p>
-    <w:p>
-      <w:proofErr w:type="spellStart"/>
+        <w:t>3.1.1 BalaC Custom Blocks</w:t>
+      </w:r>
+    </w:p>
+    <w:p>
       <w:r>
         <w:rPr>
           <w:b/>
         </w:rPr>
         <w:t>set_dc_motor</w:t>
       </w:r>
-      <w:proofErr w:type="spellEnd"/>
       <w:r>
         <w:t xml:space="preserve">: Manages the actuation of the motors. The block requires the configuration of two fundamental parameters: the output channel (selectable between </w:t>
       </w:r>
-      <w:proofErr w:type="spellStart"/>
       <w:r>
         <w:rPr>
           <w:i/>
         </w:rPr>
         <w:t>MotorA</w:t>
       </w:r>
-      <w:proofErr w:type="spellEnd"/>
       <w:r>
         <w:t xml:space="preserve"> and </w:t>
       </w:r>
-      <w:proofErr w:type="spellStart"/>
       <w:r>
         <w:rPr>
           <w:i/>
         </w:rPr>
         <w:t>MotorB</w:t>
       </w:r>
-      <w:proofErr w:type="spellEnd"/>
       <w:r>
         <w:t>) and the speed setpoint, defined via a scalar numeric value.</w:t>
       </w:r>
     </w:p>
     <w:p>
-      <w:proofErr w:type="spellStart"/>
       <w:r>
         <w:rPr>
           <w:b/>
         </w:rPr>
         <w:t>stop_dc_motor</w:t>
       </w:r>
-      <w:proofErr w:type="spellEnd"/>
       <w:r>
         <w:t>: Commands the immediate interruption of electrical power to the specified motor (A or B), stopping the wheel.</w:t>
       </w:r>
     </w:p>
     <w:p>
-      <w:proofErr w:type="spellStart"/>
       <w:r>
         <w:rPr>
           <w:b/>
         </w:rPr>
         <w:t>basic_pid_control</w:t>
       </w:r>
-      <w:proofErr w:type="spellEnd"/>
       <w:r>
         <w:t>: Implements a PID (Proportional-Integral-Derivative) feedback control algorithm. This block allows the calibration of the three characteristic gains:</w:t>
       </w:r>
@@ -1497,14 +1350,12 @@
           <w:numId w:val="9"/>
         </w:numPr>
       </w:pPr>
-      <w:proofErr w:type="spellStart"/>
       <w:r>
         <w:rPr>
           <w:i/>
         </w:rPr>
         <w:t>Kp</w:t>
       </w:r>
-      <w:proofErr w:type="spellEnd"/>
       <w:r>
         <w:t>: Proportional constant, linked to the instantaneous error.</w:t>
       </w:r>
@@ -1535,29 +1386,19 @@
           <w:numId w:val="9"/>
         </w:numPr>
       </w:pPr>
-      <w:proofErr w:type="spellStart"/>
       <w:r>
         <w:rPr>
           <w:i/>
         </w:rPr>
         <w:t>Kd</w:t>
       </w:r>
-      <w:proofErr w:type="spellEnd"/>
       <w:r>
         <w:t>: Derivative constant, for predicting the future trend of the error.</w:t>
       </w:r>
     </w:p>
     <w:p>
       <w:r>
-        <w:t xml:space="preserve">This block is the core component of the </w:t>
-      </w:r>
-      <w:proofErr w:type="spellStart"/>
-      <w:r>
-        <w:t>BalaC</w:t>
-      </w:r>
-      <w:proofErr w:type="spellEnd"/>
-      <w:r>
-        <w:t xml:space="preserve"> control system and is used to maintain the robot in a balanced upright position.</w:t>
+        <w:t>This block is the core component of the BalaC control system and is used to maintain the robot in a balanced upright position.</w:t>
       </w:r>
     </w:p>
     <w:p>
@@ -1579,23 +1420,7 @@
     </w:p>
     <w:p>
       <w:r>
-        <w:t>This work is licensed under the Creative Commons Attribution-</w:t>
-      </w:r>
-      <w:proofErr w:type="spellStart"/>
-      <w:r>
-        <w:t>NonCommercial</w:t>
-      </w:r>
-      <w:proofErr w:type="spellEnd"/>
-      <w:r>
-        <w:t>-</w:t>
-      </w:r>
-      <w:proofErr w:type="spellStart"/>
-      <w:r>
-        <w:t>ShareAlike</w:t>
-      </w:r>
-      <w:proofErr w:type="spellEnd"/>
-      <w:r>
-        <w:t xml:space="preserve"> 4.0 International License (CC BY-NC-SA 4.0).</w:t>
+        <w:t>This work is licensed under the Creative Commons Attribution-NonCommercial-ShareAlike 4.0 International License (CC BY-NC-SA 4.0).</w:t>
       </w:r>
     </w:p>
     <w:p>
@@ -1609,19 +1434,11 @@
           <w:lang w:val="it-IT"/>
         </w:rPr>
       </w:pPr>
-      <w:proofErr w:type="spellStart"/>
       <w:r>
         <w:rPr>
           <w:lang w:val="it-IT"/>
         </w:rPr>
-        <w:t>Contributors</w:t>
-      </w:r>
-      <w:proofErr w:type="spellEnd"/>
-      <w:r>
-        <w:rPr>
-          <w:lang w:val="it-IT"/>
-        </w:rPr>
-        <w:t>:</w:t>
+        <w:t>Contributors:</w:t>
       </w:r>
     </w:p>
     <w:p>
@@ -1639,7 +1456,7 @@
         <w:rPr>
           <w:lang w:val="it-IT"/>
         </w:rPr>
-        <w:t>Ripani Alessandro</w:t>
+        <w:t>David Scaradozzi</w:t>
       </w:r>
     </w:p>
     <w:p>
@@ -1657,7 +1474,7 @@
         <w:rPr>
           <w:lang w:val="it-IT"/>
         </w:rPr>
-        <w:t>Davide Collevecchio</w:t>
+        <w:t>Alessandro Ripani</w:t>
       </w:r>
     </w:p>
     <w:p>
@@ -1675,7 +1492,7 @@
         <w:rPr>
           <w:lang w:val="it-IT"/>
         </w:rPr>
-        <w:t>Francesco Giachini</w:t>
+        <w:t>Davide Collevecchio</w:t>
       </w:r>
     </w:p>
     <w:p>
@@ -1693,7 +1510,7 @@
         <w:rPr>
           <w:lang w:val="it-IT"/>
         </w:rPr>
-        <w:t>David Scaradozzi</w:t>
+        <w:t>Francesco Giachini</w:t>
       </w:r>
     </w:p>
     <w:p>
@@ -2099,29 +1916,18 @@
               <w:color w:val="000000"/>
               <w:sz w:val="16"/>
             </w:rPr>
-            <w:t>Funded by the European Union. Views and opinions expressed are</w:t>
-          </w:r>
-          <w:r>
-            <w:rPr>
-              <w:rFonts w:ascii="Calibri" w:eastAsia="Calibri" w:hAnsi="Calibri" w:cs="Calibri"/>
-              <w:color w:val="000000"/>
-              <w:sz w:val="16"/>
-            </w:rPr>
-            <w:t>, however,</w:t>
-          </w:r>
-          <w:r>
-            <w:rPr>
-              <w:rFonts w:ascii="Calibri" w:eastAsia="Calibri" w:hAnsi="Calibri" w:cs="Calibri"/>
-              <w:color w:val="000000"/>
-              <w:sz w:val="16"/>
-            </w:rPr>
-            <w:t xml:space="preserve"> those of the author(s) only and do not necessarily reflect those of the European Union or the Erasmus+ National Agency – INDIRE. Neither the European Union nor the National Agency can be held responsible for them.</w:t>
+            <w:t>Funded by the European Union. Views and opinions expressed are however those of the author(s) only and do not necessarily reflect those of the European Union or the Erasmus+ National Agency - INDIRE. Neither the European Union nor the granting authority can be held responsible for them.</w:t>
           </w:r>
         </w:p>
         <w:p>
           <w:pPr>
             <w:jc w:val="left"/>
             <w:textDirection w:val="btLr"/>
+            <w:rPr>
+              <w:rFonts w:ascii="Calibri" w:eastAsia="Calibri" w:hAnsi="Calibri" w:cs="Calibri"/>
+              <w:color w:val="000000"/>
+              <w:sz w:val="16"/>
+            </w:rPr>
           </w:pPr>
           <w:r>
             <w:rPr>
@@ -2218,6 +2024,11 @@
   <w:p>
     <w:pPr>
       <w:pStyle w:val="Header"/>
+      <w:tabs>
+        <w:tab w:val="clear" w:pos="4819"/>
+        <w:tab w:val="clear" w:pos="9638"/>
+        <w:tab w:val="left" w:pos="7938"/>
+      </w:tabs>
     </w:pPr>
     <w:r>
       <w:rPr>
@@ -2261,6 +2072,62 @@
                       <a14:shadowObscured xmlns:a14="http://schemas.microsoft.com/office/drawing/2010/main"/>
                     </a:ext>
                   </a:extLst>
+                </pic:spPr>
+              </pic:pic>
+            </a:graphicData>
+          </a:graphic>
+        </wp:inline>
+      </w:drawing>
+    </w:r>
+    <w:r>
+      <w:tab/>
+    </w:r>
+    <w:r>
+      <w:rPr>
+        <w:noProof/>
+      </w:rPr>
+      <w:drawing>
+        <wp:inline distT="0" distB="0" distL="0" distR="0" wp14:anchorId="03855E9A" wp14:editId="07482AC0">
+          <wp:extent cx="1061180" cy="403200"/>
+          <wp:effectExtent l="0" t="0" r="0" b="0"/>
+          <wp:docPr id="120098772" name="Picture 1"/>
+          <wp:cNvGraphicFramePr>
+            <a:graphicFrameLocks xmlns:a="http://schemas.openxmlformats.org/drawingml/2006/main" noChangeAspect="1"/>
+          </wp:cNvGraphicFramePr>
+          <a:graphic xmlns:a="http://schemas.openxmlformats.org/drawingml/2006/main">
+            <a:graphicData uri="http://schemas.openxmlformats.org/drawingml/2006/picture">
+              <pic:pic xmlns:pic="http://schemas.openxmlformats.org/drawingml/2006/picture">
+                <pic:nvPicPr>
+                  <pic:cNvPr id="0" name="Picture 1"/>
+                  <pic:cNvPicPr>
+                    <a:picLocks noChangeAspect="1" noChangeArrowheads="1"/>
+                  </pic:cNvPicPr>
+                </pic:nvPicPr>
+                <pic:blipFill>
+                  <a:blip r:embed="rId2">
+                    <a:extLst>
+                      <a:ext uri="{28A0092B-C50C-407E-A947-70E740481C1C}">
+                        <a14:useLocalDpi xmlns:a14="http://schemas.microsoft.com/office/drawing/2010/main" val="0"/>
+                      </a:ext>
+                    </a:extLst>
+                  </a:blip>
+                  <a:srcRect/>
+                  <a:stretch>
+                    <a:fillRect/>
+                  </a:stretch>
+                </pic:blipFill>
+                <pic:spPr bwMode="auto">
+                  <a:xfrm>
+                    <a:off x="0" y="0"/>
+                    <a:ext cx="1061180" cy="403200"/>
+                  </a:xfrm>
+                  <a:prstGeom prst="rect">
+                    <a:avLst/>
+                  </a:prstGeom>
+                  <a:noFill/>
+                  <a:ln>
+                    <a:noFill/>
+                  </a:ln>
                 </pic:spPr>
               </pic:pic>
             </a:graphicData>
@@ -4539,15 +4406,6 @@
 </file>
 
 <file path=customXml/item2.xml><?xml version="1.0" encoding="utf-8"?>
-<?mso-contentType ?>
-<FormTemplates xmlns="http://schemas.microsoft.com/sharepoint/v3/contenttype/forms">
-  <Display>DocumentLibraryForm</Display>
-  <Edit>DocumentLibraryForm</Edit>
-  <New>DocumentLibraryForm</New>
-</FormTemplates>
-</file>
-
-<file path=customXml/item3.xml><?xml version="1.0" encoding="utf-8"?>
 <ct:contentTypeSchema xmlns:ct="http://schemas.microsoft.com/office/2006/metadata/contentType" xmlns:ma="http://schemas.microsoft.com/office/2006/metadata/properties/metaAttributes" ct:_="" ma:_="" ma:contentTypeName="Document" ma:contentTypeID="0x0101003083A8BD9FC57647BFB938553732BBF1" ma:contentTypeVersion="19" ma:contentTypeDescription="Create a new document." ma:contentTypeScope="" ma:versionID="95da31e04e513e23dc057732b461e3f5">
   <xsd:schema xmlns:xsd="http://www.w3.org/2001/XMLSchema" xmlns:xs="http://www.w3.org/2001/XMLSchema" xmlns:p="http://schemas.microsoft.com/office/2006/metadata/properties" xmlns:ns2="dc1746aa-2a4b-4a12-a193-82e977ec6616" xmlns:ns3="d74c42e2-cc96-4d07-a673-45589d8c55b6" targetNamespace="http://schemas.microsoft.com/office/2006/metadata/properties" ma:root="true" ma:fieldsID="8de6b60e67ab0aa915ef7eb8e5140331" ns2:_="" ns3:_="">
     <xsd:import namespace="dc1746aa-2a4b-4a12-a193-82e977ec6616"/>
@@ -4808,6 +4666,15 @@
 </ct:contentTypeSchema>
 </file>
 
+<file path=customXml/item3.xml><?xml version="1.0" encoding="utf-8"?>
+<?mso-contentType ?>
+<FormTemplates xmlns="http://schemas.microsoft.com/sharepoint/v3/contenttype/forms">
+  <Display>DocumentLibraryForm</Display>
+  <Edit>DocumentLibraryForm</Edit>
+  <New>DocumentLibraryForm</New>
+</FormTemplates>
+</file>
+
 <file path=customXml/itemProps1.xml><?xml version="1.0" encoding="utf-8"?>
 <ds:datastoreItem xmlns:ds="http://schemas.openxmlformats.org/officeDocument/2006/customXml" ds:itemID="{309E802B-CEF9-4CAA-8E2B-47728BC0D932}">
   <ds:schemaRefs>
@@ -4820,14 +4687,6 @@
 </file>
 
 <file path=customXml/itemProps2.xml><?xml version="1.0" encoding="utf-8"?>
-<ds:datastoreItem xmlns:ds="http://schemas.openxmlformats.org/officeDocument/2006/customXml" ds:itemID="{A518187D-FF5C-49F3-B393-1CDE524F06F2}">
-  <ds:schemaRefs>
-    <ds:schemaRef ds:uri="http://schemas.microsoft.com/sharepoint/v3/contenttype/forms"/>
-  </ds:schemaRefs>
-</ds:datastoreItem>
-</file>
-
-<file path=customXml/itemProps3.xml><?xml version="1.0" encoding="utf-8"?>
 <ds:datastoreItem xmlns:ds="http://schemas.openxmlformats.org/officeDocument/2006/customXml" ds:itemID="{9733C0DC-FD37-4F41-A320-A3D2898A0AF3}">
   <ds:schemaRefs>
     <ds:schemaRef ds:uri="http://schemas.microsoft.com/office/2006/metadata/contentType"/>
@@ -4844,4 +4703,12 @@
     <ds:schemaRef ds:uri="http://schemas.microsoft.com/internal/obd"/>
   </ds:schemaRefs>
 </ds:datastoreItem>
+</file>
+
+<file path=customXml/itemProps3.xml><?xml version="1.0" encoding="utf-8"?>
+<ds:datastoreItem xmlns:ds="http://schemas.openxmlformats.org/officeDocument/2006/customXml" ds:itemID="{A518187D-FF5C-49F3-B393-1CDE524F06F2}">
+  <ds:schemaRefs>
+    <ds:schemaRef ds:uri="http://schemas.microsoft.com/sharepoint/v3/contenttype/forms"/>
+  </ds:schemaRefs>
+</ds:datastoreItem>
 </file>
</xml_diff>

<commit_message>
Add Apache 2.0 license and third-party notices
Clarify licensing and attribution for included third-party components. Adds a full Apache-2.0 text file (LICENSE-APACHE-2.0.txt), updates LICENSE to note Apache-2.0 components bundled in the AUTOSTEM executable and point to NOTICE.md, and extends NOTICE.md with attribution for UIFlow Virtual and related acknowledgements. README bumped the project version to 1.2.0 and now documents the third-party components and that the Apache 2.0 license is included in the distribution. Updated binary user/operator manuals as well.
</commit_message>
<xml_diff>
--- a/docs/BRIDGE_Operator_Manual_AutoSTEM.docx
+++ b/docs/BRIDGE_Operator_Manual_AutoSTEM.docx
@@ -385,7 +385,31 @@
     </w:p>
     <w:p>
       <w:r>
-        <w:t>In this context, the application is centered on the BalaC robot and its PID control playground, where users are tasked with creating programs of increasing complexity by tuning control parameters and observing system behavior in real time.</w:t>
+        <w:t xml:space="preserve">In this context, the application is </w:t>
+      </w:r>
+      <w:proofErr w:type="spellStart"/>
+      <w:r>
+        <w:t>centered</w:t>
+      </w:r>
+      <w:proofErr w:type="spellEnd"/>
+      <w:r>
+        <w:t xml:space="preserve"> on the </w:t>
+      </w:r>
+      <w:proofErr w:type="spellStart"/>
+      <w:r>
+        <w:t>BalaC</w:t>
+      </w:r>
+      <w:proofErr w:type="spellEnd"/>
+      <w:r>
+        <w:t xml:space="preserve"> robot and its PID control playground, where users are tasked with creating programs of increasing complexity by tuning control parameters and observing system </w:t>
+      </w:r>
+      <w:proofErr w:type="spellStart"/>
+      <w:r>
+        <w:t>behavior</w:t>
+      </w:r>
+      <w:proofErr w:type="spellEnd"/>
+      <w:r>
+        <w:t xml:space="preserve"> in real time.</w:t>
       </w:r>
     </w:p>
     <w:p>
@@ -465,7 +489,15 @@
     </w:p>
     <w:p>
       <w:r>
-        <w:t>The BalaC PID playground is particularly suited for secondary school and early university level education, where users can experiment with control logic in a safe simulated environment.</w:t>
+        <w:t xml:space="preserve">The </w:t>
+      </w:r>
+      <w:proofErr w:type="spellStart"/>
+      <w:r>
+        <w:t>BalaC</w:t>
+      </w:r>
+      <w:proofErr w:type="spellEnd"/>
+      <w:r>
+        <w:t xml:space="preserve"> PID playground is particularly suited for secondary school and early university level education, where users can experiment with control logic in a safe simulated environment.</w:t>
       </w:r>
     </w:p>
     <w:p>
@@ -488,12 +520,36 @@
     </w:p>
     <w:p>
       <w:r>
-        <w:t>The BalaC robot model, used in the PID playground, was developed using CAD tools (e.g., Solid Edge), while environmental assets and additional graphical elements were created using tools such as Blender and integrated within Unity.</w:t>
-      </w:r>
-    </w:p>
-    <w:p>
-      <w:r>
-        <w:t>All graphical models were imported into Unity in standard formats such as .obj and .fbx.</w:t>
+        <w:t xml:space="preserve">The </w:t>
+      </w:r>
+      <w:proofErr w:type="spellStart"/>
+      <w:r>
+        <w:t>BalaC</w:t>
+      </w:r>
+      <w:proofErr w:type="spellEnd"/>
+      <w:r>
+        <w:t xml:space="preserve"> robot model, used in the PID playground, was developed using CAD tools (e.g., Solid Edge), while environmental assets and additional graphical elements were created using tools such as Blender and integrated within Unity.</w:t>
+      </w:r>
+    </w:p>
+    <w:p>
+      <w:r>
+        <w:t>All graphical models were imported into Unity in standard formats such as .</w:t>
+      </w:r>
+      <w:proofErr w:type="spellStart"/>
+      <w:r>
+        <w:t>obj</w:t>
+      </w:r>
+      <w:proofErr w:type="spellEnd"/>
+      <w:r>
+        <w:t xml:space="preserve"> and .</w:t>
+      </w:r>
+      <w:proofErr w:type="spellStart"/>
+      <w:r>
+        <w:t>fbx</w:t>
+      </w:r>
+      <w:proofErr w:type="spellEnd"/>
+      <w:r>
+        <w:t>.</w:t>
       </w:r>
     </w:p>
     <w:p>
@@ -754,7 +810,15 @@
           </w:tcPr>
           <w:p>
             <w:r>
-              <w:t>Modern quad-core processor (e.g., Intel Core i5 or AMD Ryzen equivalent).</w:t>
+              <w:t xml:space="preserve">Modern quad-core processor (e.g., Intel Core i5 or AMD </w:t>
+            </w:r>
+            <w:proofErr w:type="spellStart"/>
+            <w:r>
+              <w:t>Ryzen</w:t>
+            </w:r>
+            <w:proofErr w:type="spellEnd"/>
+            <w:r>
+              <w:t xml:space="preserve"> equivalent).</w:t>
             </w:r>
           </w:p>
         </w:tc>
@@ -912,14 +976,14 @@
           <w:rPr>
             <w:rStyle w:val="Hyperlink"/>
           </w:rPr>
-          <w:t>https://github.com/ANcybernetics/AutoSTEM-VirtualToolkit/releases/tag/v1.0.0</w:t>
+          <w:t>https://github.com/ANcybernetics/AutoSTEM-VirtualToolkit/releases</w:t>
         </w:r>
       </w:hyperlink>
       <w:r>
-        <w:rPr>
-          <w:u w:val="single"/>
-        </w:rPr>
         <w:t xml:space="preserve"> </w:t>
+      </w:r>
+      <w:r>
+        <w:t>and find the latest release.</w:t>
       </w:r>
     </w:p>
     <w:p>
@@ -1011,7 +1075,61 @@
           <w:b/>
           <w:bCs/>
         </w:rPr>
-        <w:t>https://github.com/ANcybernetics/AutoSTEM-VirtualToolkit/releases/tag/v1.0.0</w:t>
+        <w:t>https://github.com/ANcybernetics/AutoSTEM-VirtualToolkit/releases/tag/</w:t>
+      </w:r>
+      <w:r>
+        <w:rPr>
+          <w:rFonts w:ascii="Courier New" w:hAnsi="Courier New"/>
+          <w:b/>
+          <w:bCs/>
+          <w:u w:val="single"/>
+        </w:rPr>
+        <w:t>v</w:t>
+      </w:r>
+      <w:r>
+        <w:rPr>
+          <w:rFonts w:ascii="Courier New" w:hAnsi="Courier New"/>
+          <w:b/>
+          <w:bCs/>
+          <w:u w:val="single"/>
+        </w:rPr>
+        <w:t>1</w:t>
+      </w:r>
+      <w:r>
+        <w:rPr>
+          <w:rFonts w:ascii="Courier New" w:hAnsi="Courier New"/>
+          <w:b/>
+          <w:bCs/>
+          <w:u w:val="single"/>
+        </w:rPr>
+        <w:t>.</w:t>
+      </w:r>
+      <w:r>
+        <w:rPr>
+          <w:rFonts w:ascii="Courier New" w:hAnsi="Courier New"/>
+          <w:b/>
+          <w:bCs/>
+          <w:u w:val="single"/>
+        </w:rPr>
+        <w:t>x</w:t>
+      </w:r>
+      <w:r>
+        <w:rPr>
+          <w:rFonts w:ascii="Courier New" w:hAnsi="Courier New"/>
+          <w:b/>
+          <w:bCs/>
+          <w:u w:val="single"/>
+        </w:rPr>
+        <w:t>.</w:t>
+      </w:r>
+      <w:r>
+        <w:rPr>
+          <w:rFonts w:ascii="Courier New" w:hAnsi="Courier New"/>
+          <w:b/>
+          <w:bCs/>
+          <w:u w:val="single"/>
+        </w:rPr>
+        <w:t>x</w:t>
       </w:r>
       <w:r>
         <w:rPr>
@@ -1091,7 +1209,15 @@
     </w:p>
     <w:p>
       <w:r>
-        <w:t>Once executed, the game will start, presenting the main screen with access to the BalaC PID playground environment.</w:t>
+        <w:t xml:space="preserve">Once executed, the game will start, presenting the main screen with access to the </w:t>
+      </w:r>
+      <w:proofErr w:type="spellStart"/>
+      <w:r>
+        <w:t>BalaC</w:t>
+      </w:r>
+      <w:proofErr w:type="spellEnd"/>
+      <w:r>
+        <w:t xml:space="preserve"> PID playground environment.</w:t>
       </w:r>
     </w:p>
     <w:p>
@@ -1115,7 +1241,15 @@
     </w:p>
     <w:p>
       <w:r>
-        <w:t>In this configuration, the simulator focuses on the BalaC robot and its PID control playground.</w:t>
+        <w:t xml:space="preserve">In this configuration, the simulator focuses on the </w:t>
+      </w:r>
+      <w:proofErr w:type="spellStart"/>
+      <w:r>
+        <w:t>BalaC</w:t>
+      </w:r>
+      <w:proofErr w:type="spellEnd"/>
+      <w:r>
+        <w:t xml:space="preserve"> robot and its PID control playground.</w:t>
       </w:r>
     </w:p>
     <w:p>
@@ -1205,7 +1339,15 @@
     </w:p>
     <w:p>
       <w:r>
-        <w:t>This section describes the custom blocks available for controlling the BalaC robot within the PID playground environment.</w:t>
+        <w:t xml:space="preserve">This section describes the custom blocks available for controlling the </w:t>
+      </w:r>
+      <w:proofErr w:type="spellStart"/>
+      <w:r>
+        <w:t>BalaC</w:t>
+      </w:r>
+      <w:proofErr w:type="spellEnd"/>
+      <w:r>
+        <w:t xml:space="preserve"> robot within the PID playground environment.</w:t>
       </w:r>
     </w:p>
     <w:p>
@@ -1261,12 +1403,14 @@
         </w:rPr>
         <w:t xml:space="preserve">Figure 3.1: </w:t>
       </w:r>
+      <w:proofErr w:type="spellStart"/>
       <w:r>
         <w:rPr>
           <w:i/>
         </w:rPr>
         <w:t>BalaC</w:t>
       </w:r>
+      <w:proofErr w:type="spellEnd"/>
       <w:r>
         <w:t xml:space="preserve"> </w:t>
       </w:r>
@@ -1279,7 +1423,15 @@
     </w:p>
     <w:p>
       <w:r>
-        <w:t>Access to the control primitives of AutoSTEM occurs through the dedicated section in the programming interface. By selecting the "BalaC" category, one accesses the panel containing the functional blocks for managing movement and sensors.</w:t>
+        <w:t>Access to the control primitives of AutoSTEM occurs through the dedicated section in the programming interface. By selecting the "</w:t>
+      </w:r>
+      <w:proofErr w:type="spellStart"/>
+      <w:r>
+        <w:t>BalaC</w:t>
+      </w:r>
+      <w:proofErr w:type="spellEnd"/>
+      <w:r>
+        <w:t>" category, one accesses the panel containing the functional blocks for managing movement and sensors.</w:t>
       </w:r>
     </w:p>
     <w:p>
@@ -1288,56 +1440,74 @@
       </w:pPr>
       <w:r>
         <w:lastRenderedPageBreak/>
-        <w:t>3.1.1 BalaC Custom Blocks</w:t>
-      </w:r>
-    </w:p>
-    <w:p>
+        <w:t xml:space="preserve">3.1.1 </w:t>
+      </w:r>
+      <w:proofErr w:type="spellStart"/>
+      <w:r>
+        <w:t>BalaC</w:t>
+      </w:r>
+      <w:proofErr w:type="spellEnd"/>
+      <w:r>
+        <w:t xml:space="preserve"> Custom Blocks</w:t>
+      </w:r>
+    </w:p>
+    <w:p>
+      <w:proofErr w:type="spellStart"/>
       <w:r>
         <w:rPr>
           <w:b/>
         </w:rPr>
         <w:t>set_dc_motor</w:t>
       </w:r>
+      <w:proofErr w:type="spellEnd"/>
       <w:r>
         <w:t xml:space="preserve">: Manages the actuation of the motors. The block requires the configuration of two fundamental parameters: the output channel (selectable between </w:t>
       </w:r>
+      <w:proofErr w:type="spellStart"/>
       <w:r>
         <w:rPr>
           <w:i/>
         </w:rPr>
         <w:t>MotorA</w:t>
       </w:r>
+      <w:proofErr w:type="spellEnd"/>
       <w:r>
         <w:t xml:space="preserve"> and </w:t>
       </w:r>
+      <w:proofErr w:type="spellStart"/>
       <w:r>
         <w:rPr>
           <w:i/>
         </w:rPr>
         <w:t>MotorB</w:t>
       </w:r>
+      <w:proofErr w:type="spellEnd"/>
       <w:r>
         <w:t>) and the speed setpoint, defined via a scalar numeric value.</w:t>
       </w:r>
     </w:p>
     <w:p>
+      <w:proofErr w:type="spellStart"/>
       <w:r>
         <w:rPr>
           <w:b/>
         </w:rPr>
         <w:t>stop_dc_motor</w:t>
       </w:r>
+      <w:proofErr w:type="spellEnd"/>
       <w:r>
         <w:t>: Commands the immediate interruption of electrical power to the specified motor (A or B), stopping the wheel.</w:t>
       </w:r>
     </w:p>
     <w:p>
+      <w:proofErr w:type="spellStart"/>
       <w:r>
         <w:rPr>
           <w:b/>
         </w:rPr>
         <w:t>basic_pid_control</w:t>
       </w:r>
+      <w:proofErr w:type="spellEnd"/>
       <w:r>
         <w:t>: Implements a PID (Proportional-Integral-Derivative) feedback control algorithm. This block allows the calibration of the three characteristic gains:</w:t>
       </w:r>
@@ -1350,12 +1520,14 @@
           <w:numId w:val="9"/>
         </w:numPr>
       </w:pPr>
+      <w:proofErr w:type="spellStart"/>
       <w:r>
         <w:rPr>
           <w:i/>
         </w:rPr>
         <w:t>Kp</w:t>
       </w:r>
+      <w:proofErr w:type="spellEnd"/>
       <w:r>
         <w:t>: Proportional constant, linked to the instantaneous error.</w:t>
       </w:r>
@@ -1386,19 +1558,29 @@
           <w:numId w:val="9"/>
         </w:numPr>
       </w:pPr>
+      <w:proofErr w:type="spellStart"/>
       <w:r>
         <w:rPr>
           <w:i/>
         </w:rPr>
         <w:t>Kd</w:t>
       </w:r>
+      <w:proofErr w:type="spellEnd"/>
       <w:r>
         <w:t>: Derivative constant, for predicting the future trend of the error.</w:t>
       </w:r>
     </w:p>
     <w:p>
       <w:r>
-        <w:t>This block is the core component of the BalaC control system and is used to maintain the robot in a balanced upright position.</w:t>
+        <w:t xml:space="preserve">This block is the core component of the </w:t>
+      </w:r>
+      <w:proofErr w:type="spellStart"/>
+      <w:r>
+        <w:t>BalaC</w:t>
+      </w:r>
+      <w:proofErr w:type="spellEnd"/>
+      <w:r>
+        <w:t xml:space="preserve"> control system and is used to maintain the robot in a balanced upright position.</w:t>
       </w:r>
     </w:p>
     <w:p>
@@ -1420,7 +1602,23 @@
     </w:p>
     <w:p>
       <w:r>
-        <w:t>This work is licensed under the Creative Commons Attribution-NonCommercial-ShareAlike 4.0 International License (CC BY-NC-SA 4.0).</w:t>
+        <w:t>This work is licensed under the Creative Commons Attribution-</w:t>
+      </w:r>
+      <w:proofErr w:type="spellStart"/>
+      <w:r>
+        <w:t>NonCommercial</w:t>
+      </w:r>
+      <w:proofErr w:type="spellEnd"/>
+      <w:r>
+        <w:t>-</w:t>
+      </w:r>
+      <w:proofErr w:type="spellStart"/>
+      <w:r>
+        <w:t>ShareAlike</w:t>
+      </w:r>
+      <w:proofErr w:type="spellEnd"/>
+      <w:r>
+        <w:t xml:space="preserve"> 4.0 International License (CC BY-NC-SA 4.0).</w:t>
       </w:r>
     </w:p>
     <w:p>
@@ -1434,11 +1632,19 @@
           <w:lang w:val="it-IT"/>
         </w:rPr>
       </w:pPr>
+      <w:proofErr w:type="spellStart"/>
       <w:r>
         <w:rPr>
           <w:lang w:val="it-IT"/>
         </w:rPr>
-        <w:t>Contributors:</w:t>
+        <w:t>Contributors</w:t>
+      </w:r>
+      <w:proofErr w:type="spellEnd"/>
+      <w:r>
+        <w:rPr>
+          <w:lang w:val="it-IT"/>
+        </w:rPr>
+        <w:t>:</w:t>
       </w:r>
     </w:p>
     <w:p>

</xml_diff>